<commit_message>
Memoria: supermercado en lugar de alimentacion
</commit_message>
<xml_diff>
--- a/memoria/Memoria_DSMarket.docx
+++ b/memoria/Memoria_DSMarket.docx
@@ -1102,7 +1102,7 @@
         <w:pStyle w:val="FirstParagraph"/>
       </w:pPr>
       <w:r>
-        <w:t xml:space="preserve">La distribución minorista de alimentación opera con márgenes brutos estrechos y volúmenes muy</w:t>
+        <w:t xml:space="preserve">La distribución minorista de gran consumo opera con márgenes brutos estrechos y volúmenes muy</w:t>
       </w:r>
       <w:r>
         <w:t xml:space="preserve"> </w:t>
@@ -7054,7 +7054,7 @@
         <w:t xml:space="preserve"> </w:t>
       </w:r>
       <w:r>
-        <w:t xml:space="preserve">alimentación. Una</w:t>
+        <w:t xml:space="preserve">gran consumo. Una</w:t>
       </w:r>
       <w:r>
         <w:t xml:space="preserve"> </w:t>
@@ -8657,7 +8657,7 @@
         <w:t xml:space="preserve"> </w:t>
       </w:r>
       <w:r>
-        <w:t xml:space="preserve">de alimentación y hogar se parten en subgrupos que solo se diferencian en matices. Con 20, uno de</w:t>
+        <w:t xml:space="preserve">de supermercado y hogar se parten en subgrupos que solo se diferencian en matices. Con 20, uno de</w:t>
       </w:r>
       <w:r>
         <w:t xml:space="preserve"> </w:t>
@@ -8849,7 +8849,7 @@
               <w:jc w:val="left"/>
             </w:pPr>
             <w:r>
-              <w:t xml:space="preserve">72 % alimentación, el precio más bajo (2,6 $). Venta muy alta (37 unidades al día entre las diez tiendas) y casi diaria: 5 % de días sin venta.</w:t>
+              <w:t xml:space="preserve">72 % supermercado, el precio más bajo (2,6 $). Venta muy alta (37 unidades al día entre las diez tiendas) y casi diaria: 5 % de días sin venta.</w:t>
             </w:r>
           </w:p>
         </w:tc>
@@ -9094,7 +9094,7 @@
               <w:jc w:val="left"/>
             </w:pPr>
             <w:r>
-              <w:t xml:space="preserve">Mixto (accesorios, alimentación y hogar: mesa y regalo). Venden casi el doble en diciembre (1,89 veces).</w:t>
+              <w:t xml:space="preserve">Mixto (accesorios, supermercado y hogar: mesa y regalo). Venden casi el doble en diciembre (1,89 veces).</w:t>
             </w:r>
           </w:p>
         </w:tc>
@@ -9428,7 +9428,7 @@
         <w:t xml:space="preserve"> </w:t>
       </w:r>
       <w:r>
-        <w:t xml:space="preserve">semana, diciembre, índice de precio y peso de alimentación y hogar). El volumen se dejó fuera de la</w:t>
+        <w:t xml:space="preserve">semana, diciembre, índice de precio y peso de supermercado y hogar). El volumen se dejó fuera de la</w:t>
       </w:r>
       <w:r>
         <w:t xml:space="preserve"> </w:t>
@@ -14224,7 +14224,7 @@
         <w:t xml:space="preserve"> </w:t>
       </w:r>
       <w:r>
-        <w:t xml:space="preserve">Un producto de alimentación de Filadelfia que vende unas ocho unidades al</w:t>
+        <w:t xml:space="preserve">Un producto de supermercado de Filadelfia que vende unas ocho unidades al</w:t>
       </w:r>
       <w:r>
         <w:t xml:space="preserve"> </w:t>
@@ -18907,7 +18907,7 @@
         <w:t xml:space="preserve"> </w:t>
       </w:r>
       <w:r>
-        <w:t xml:space="preserve">es el correcto, la magnitud es plausible para bienes de alimentación, la significación</w:t>
+        <w:t xml:space="preserve">es el correcto, la magnitud es plausible para bienes de gran consumo, la significación</w:t>
       </w:r>
       <w:r>
         <w:t xml:space="preserve"> </w:t>

</xml_diff>

<commit_message>
Memoria: coherencia con los notebooks
</commit_message>
<xml_diff>
--- a/memoria/Memoria_DSMarket.docx
+++ b/memoria/Memoria_DSMarket.docx
@@ -5254,7 +5254,7 @@
         <w:t xml:space="preserve"> </w:t>
       </w:r>
       <w:r>
-        <w:t xml:space="preserve">categoría, departamento, tienda, ciudad y el grupo de producto obtenido en §7.2.</w:t>
+        <w:t xml:space="preserve">categoría, departamento, tienda y ciudad. El grupo de producto obtenido en §7.2 se probó también como variable y se retiró, porque no mejoraba la predicción (cuaderno 03b).</w:t>
       </w:r>
     </w:p>
     <w:p>
@@ -8705,19 +8705,19 @@
         <w:t xml:space="preserve"> </w:t>
       </w:r>
       <w:r>
-        <w:t xml:space="preserve">facturación. Con ellas se asignó a cada grupo un nombre que dice qué productos contiene. Cuando una</w:t>
-      </w:r>
-      <w:r>
-        <w:t xml:space="preserve"> </w:t>
-      </w:r>
-      <w:r>
-        <w:t xml:space="preserve">categoría es mayoritaria, aparece en el nombre; cuando el grupo es mixto, se nombra por el momento</w:t>
-      </w:r>
-      <w:r>
-        <w:t xml:space="preserve"> </w:t>
-      </w:r>
-      <w:r>
-        <w:t xml:space="preserve">de compra.</w:t>
+        <w:t xml:space="preserve">facturación. Con ellas se asignó a cada grupo un nombre que describe su comportamiento de compra (ritmo de venta, momento de compra o precio), ya que la segmentación se hizo por comportamiento y no por categoría; la categoría predominante se indica solo como contexto en la descripción.</w:t>
+      </w:r>
+      <w:r>
+        <w:t xml:space="preserve"/>
+      </w:r>
+      <w:r>
+        <w:t xml:space="preserve"/>
+      </w:r>
+      <w:r>
+        <w:t xml:space="preserve"/>
+      </w:r>
+      <w:r>
+        <w:t xml:space="preserve"/>
       </w:r>
     </w:p>
     <w:tbl>
@@ -9546,19 +9546,19 @@
         <w:pStyle w:val="FirstParagraph"/>
       </w:pPr>
       <w:r>
-        <w:t xml:space="preserve">La lectura de negocio es que el perfil de una tienda depende más de su entorno —el tipo de barrio,</w:t>
-      </w:r>
-      <w:r>
-        <w:t xml:space="preserve"> </w:t>
-      </w:r>
-      <w:r>
-        <w:t xml:space="preserve">la clientela— que de su ciudad. Para una apertura, la referencia de surtido y de previsión inicial</w:t>
-      </w:r>
-      <w:r>
-        <w:t xml:space="preserve"> </w:t>
-      </w:r>
-      <w:r>
-        <w:t xml:space="preserve">debería ser la tienda existente más parecida en tipo de barrio, no la media de su ciudad.</w:t>
+        <w:t xml:space="preserve">La lectura de negocio es que el perfil de una tienda no viene determinado por su ciudad. Para una apertura, la referencia de surtido y de previsión inicial debería ser la tienda existente que se espere más parecida (por tipo de zona y de clientela), no la media de su ciudad.</w:t>
+      </w:r>
+      <w:r>
+        <w:t xml:space="preserve"/>
+      </w:r>
+      <w:r>
+        <w:t xml:space="preserve"/>
+      </w:r>
+      <w:r>
+        <w:t xml:space="preserve"/>
+      </w:r>
+      <w:r>
+        <w:t xml:space="preserve"/>
       </w:r>
     </w:p>
     <w:p>
@@ -10249,19 +10249,19 @@
         <w:t xml:space="preserve"> </w:t>
       </w:r>
       <w:r>
-        <w:t xml:space="preserve">estructura necesaria para modelar. El grupo de producto entra como variable en el modelo de</w:t>
-      </w:r>
-      <w:r>
-        <w:t xml:space="preserve"> </w:t>
-      </w:r>
-      <w:r>
-        <w:t xml:space="preserve">predicción, y la clasificación ABC/XYZ, junto con el grupo, determina más adelante qué método de</w:t>
-      </w:r>
-      <w:r>
-        <w:t xml:space="preserve"> </w:t>
-      </w:r>
-      <w:r>
-        <w:t xml:space="preserve">reposición se aplica a cada serie.</w:t>
+        <w:t xml:space="preserve">estructura necesaria para modelar. El grupo de producto se probó como variable del modelo de predicción y no mejoró la precisión, por lo que se usa para describir el error por tipo de producto; la clase XYZ determina más adelante qué método de reposición se aplica a cada serie.</w:t>
+      </w:r>
+      <w:r>
+        <w:t xml:space="preserve"/>
+      </w:r>
+      <w:r>
+        <w:t xml:space="preserve"/>
+      </w:r>
+      <w:r>
+        <w:t xml:space="preserve"/>
+      </w:r>
+      <w:r>
+        <w:t xml:space="preserve"/>
       </w:r>
     </w:p>
     <w:p>
@@ -15325,13 +15325,13 @@
         <w:t xml:space="preserve"> </w:t>
       </w:r>
       <w:r>
-        <w:t xml:space="preserve">estable— el término de incertidumbre se estima con el desvío histórico, que en esas series es</w:t>
-      </w:r>
-      <w:r>
-        <w:t xml:space="preserve"> </w:t>
-      </w:r>
-      <w:r>
-        <w:t xml:space="preserve">fiable. Para las de</w:t>
+        <w:t xml:space="preserve">estable— el nivel objetivo se toma del percentil de las ventas históricas en ventanas de nueve días, que en esas series es fiable.</w:t>
+      </w:r>
+      <w:r>
+        <w:t xml:space="preserve"/>
+      </w:r>
+      <w:r>
+        <w:t xml:space="preserve"> Para las de</w:t>
       </w:r>
       <w:r>
         <w:t xml:space="preserve"> </w:t>
@@ -15720,7 +15720,7 @@
         <w:t xml:space="preserve"> </w:t>
       </w:r>
       <w:r>
-        <w:t xml:space="preserve">(RMSSE 0,88) y uno de los de mayor error, Venta esporádica con pico en eventos (0,93). Leído así,</w:t>
+        <w:t xml:space="preserve">(WAPE semanal del 35 %) y uno de los de mayor error, Venta esporádica con pico en eventos (68 %). Leído así,</w:t>
       </w:r>
       <w:r>
         <w:t xml:space="preserve"> </w:t>
@@ -15934,7 +15934,7 @@
         <w:t xml:space="preserve"> </w:t>
       </w:r>
       <w:r>
-        <w:t xml:space="preserve">está fuera de temporada y pesa poco en dinero (unos 800 de 65.000 dólares); necesita una regla de</w:t>
+        <w:t xml:space="preserve">está fuera de temporada y pesa poco en dinero (unos 800 de 67.600 dólares); necesita una regla de</w:t>
       </w:r>
       <w:r>
         <w:t xml:space="preserve"> </w:t>
@@ -15948,7 +15948,7 @@
         <w:pStyle w:val="BodyText"/>
       </w:pPr>
       <w:r>
-        <w:t xml:space="preserve">La explicación es que en las series estables el desvío histórico es un estimador excelente de la</w:t>
+        <w:t xml:space="preserve">La explicación es que en las series estables el percentil histórico es un estimador excelente de la</w:t>
       </w:r>
       <w:r>
         <w:t xml:space="preserve"> </w:t>
@@ -16494,7 +16494,7 @@
               <w:rPr>
                 <w:b/>
               </w:rPr>
-              <w:t xml:space="preserve">B · LightGBM + desvío histórico</w:t>
+              <w:t xml:space="preserve">B · LightGBM + desviación histórica</w:t>
             </w:r>
           </w:p>
         </w:tc>
@@ -16592,7 +16592,7 @@
               <w:jc w:val="left"/>
             </w:pPr>
             <w:r>
-              <w:t xml:space="preserve">C · LightGBM + desvío de residuos</w:t>
+              <w:t xml:space="preserve">C · LightGBM + desviación de residuos</w:t>
             </w:r>
           </w:p>
         </w:tc>
@@ -24323,13 +24323,13 @@
         <w:t xml:space="preserve"> </w:t>
       </w:r>
       <w:r>
-        <w:t xml:space="preserve">codo y estables entre semillas (índice de Rand ajustado 0,98), con nombres ligados a lo que</w:t>
-      </w:r>
-      <w:r>
-        <w:t xml:space="preserve"> </w:t>
-      </w:r>
-      <w:r>
-        <w:t xml:space="preserve">contienen: Alta rotación diaria, Pico de fin de semana, Rotación baja sin picos,</w:t>
+        <w:t xml:space="preserve">codo y estables entre semillas (índice de Rand ajustado 0,98), con nombres que describen su comportamiento de compra:</w:t>
+      </w:r>
+      <w:r>
+        <w:t xml:space="preserve"/>
+      </w:r>
+      <w:r>
+        <w:t xml:space="preserve"> Alta rotación diaria, Pico de fin de semana, Rotación baja sin picos,</w:t>
       </w:r>
       <w:r>
         <w:t xml:space="preserve"> </w:t>

</xml_diff>

<commit_message>
Memoria 7.6, 7.7 y anexos; 03b: retoques de redaccion
</commit_message>
<xml_diff>
--- a/memoria/Memoria_DSMarket.docx
+++ b/memoria/Memoria_DSMarket.docx
@@ -63,7 +63,7 @@
         <w:t xml:space="preserve"> </w:t>
       </w:r>
       <w:r>
-        <w:t xml:space="preserve">Juan Pablo Ceruso · Carmen Candial · Adrià Viñas</w:t>
+        <w:t xml:space="preserve">[Nombre y apellidos] · [Nombre y apellidos] · [Nombre y apellidos]</w:t>
       </w:r>
     </w:p>
     <w:p>
@@ -81,7 +81,7 @@
         <w:t xml:space="preserve"> </w:t>
       </w:r>
       <w:r>
-        <w:t xml:space="preserve">Raquel Revilla</w:t>
+        <w:t xml:space="preserve">[Nombre y apellidos]</w:t>
       </w:r>
     </w:p>
     <w:p>
@@ -99,7 +99,7 @@
         <w:t xml:space="preserve"> </w:t>
       </w:r>
       <w:r>
-        <w:t xml:space="preserve">21 de octubre de 2026 ·</w:t>
+        <w:t xml:space="preserve">[fecha] ·</w:t>
       </w:r>
       <w:r>
         <w:t xml:space="preserve"> </w:t>
@@ -115,7 +115,7 @@
         <w:t xml:space="preserve"> </w:t>
       </w:r>
       <w:r>
-        <w:t xml:space="preserve">octubre de 2026</w:t>
+        <w:t xml:space="preserve">[fecha]</w:t>
       </w:r>
     </w:p>
     <w:p>
@@ -20773,7 +20773,7 @@
         <w:pStyle w:val="FirstParagraph"/>
       </w:pPr>
       <w:r>
-        <w:t xml:space="preserve">Se documentan aquí tres errores de implementación que se detectaron durante el trabajo, porque</w:t>
+        <w:t xml:space="preserve">Se documentan aquí varios errores de implementación que se detectaron durante el trabajo, porque</w:t>
       </w:r>
       <w:r>
         <w:t xml:space="preserve"> </w:t>
@@ -21428,7 +21428,7 @@
         <w:t xml:space="preserve"> </w:t>
       </w:r>
       <w:r>
-        <w:t xml:space="preserve">corregida, el grupo «Fin de semana/hogar» pasa a encabezar la elevación de fin de semana con</w:t>
+        <w:t xml:space="preserve">corregida, el grupo «Pico de fin de semana» pasa a encabezar la elevación de fin de semana con</w:t>
       </w:r>
       <w:r>
         <w:t xml:space="preserve"> </w:t>
@@ -22079,13 +22079,7 @@
         <w:t xml:space="preserve"> </w:t>
       </w:r>
       <w:r>
-        <w:t xml:space="preserve">Se eligen dos establecimientos de grupos de</w:t>
-      </w:r>
-      <w:r>
-        <w:t xml:space="preserve"> </w:t>
-      </w:r>
-      <w:r>
-        <w:t xml:space="preserve">comportamiento distintos y se aplican las sugerencias en el segmento AX, que concentra el 56% de</w:t>
+        <w:t xml:space="preserve">Se eligen dos establecimientos con perfiles de venta distintos (§7.2.4) y se aplican las sugerencias en el segmento AX, que concentra el 56% de</w:t>
       </w:r>
       <w:r>
         <w:t xml:space="preserve"> </w:t>
@@ -24169,7 +24163,7 @@
         <w:t xml:space="preserve"> </w:t>
       </w:r>
       <w:r>
-        <w:t xml:space="preserve">proyecto tiene un equipo de cuatro personas, un almacén de 91 MB en su capa de consumo y un</w:t>
+        <w:t xml:space="preserve">proyecto tiene un equipo de tres personas, un almacén de 91 MB en su capa de consumo y un</w:t>
       </w:r>
       <w:r>
         <w:t xml:space="preserve"> </w:t>
@@ -24887,7 +24881,7 @@
         <w:pStyle w:val="BodyText"/>
       </w:pPr>
       <w:r>
-        <w:t xml:space="preserve">Las cuatro ausencias no son accidentales y tres de ellas comparten causa: dependen de que el</w:t>
+        <w:t xml:space="preserve">Las cinco ausencias no son accidentales y tres de ellas comparten causa: dependen de que el</w:t>
       </w:r>
       <w:r>
         <w:t xml:space="preserve"> </w:t>
@@ -27877,7 +27871,7 @@
               <w:jc w:val="left"/>
             </w:pPr>
             <w:r>
-              <w:t xml:space="preserve">Comparación de modelos, validación y reconciliación; revisión con la segmentación vigente, métrica semanal, eventos semanales y modelo final de 400 días</w:t>
+              <w:t xml:space="preserve">Comparación de modelos, validación y reconciliación; revisión sin la variable de grupo de producto, métrica semanal, eventos semanales y modelo final de 400 días</w:t>
             </w:r>
           </w:p>
         </w:tc>
@@ -30802,7 +30796,7 @@
         <w:rPr>
           <w:rStyle w:val="VerbatimChar"/>
         </w:rPr>
-        <w:t xml:space="preserve">.github/ci.yml</w:t>
+        <w:t xml:space="preserve">.github/workflows/ci.yml</w:t>
       </w:r>
       <w:r>
         <w:t xml:space="preserve"> </w:t>

</xml_diff>

<commit_message>
Segunda revision: % supermercado en el 02 y figura 7.8
</commit_message>
<xml_diff>
--- a/memoria/Memoria_DSMarket.docx
+++ b/memoria/Memoria_DSMarket.docx
@@ -9754,7 +9754,7 @@
       <w:r>
         <w:drawing>
           <wp:inline>
-            <wp:extent cx="5334000" cy="2132263"/>
+            <wp:extent cx="5334000" cy="2133600"/>
             <wp:effectExtent b="0" l="0" r="0" t="0"/>
             <wp:docPr descr="Figura 7.8. Perfil de cada tienda respecto a la media y matriz de parecido entre tiendas. Fuente: elaboración propia." title="" id="113" name="Picture"/>
             <a:graphic>
@@ -9775,7 +9775,7 @@
                   <pic:spPr bwMode="auto">
                     <a:xfrm>
                       <a:off x="0" y="0"/>
-                      <a:ext cx="5334000" cy="2132263"/>
+                      <a:ext cx="5334000" cy="2133600"/>
                     </a:xfrm>
                     <a:prstGeom prst="rect">
                       <a:avLst/>

</xml_diff>

<commit_message>
Tercera revision: cotas de censura coherentes con el notebook 04
</commit_message>
<xml_diff>
--- a/memoria/Memoria_DSMarket.docx
+++ b/memoria/Memoria_DSMarket.docx
@@ -18784,7 +18784,7 @@
               <w:jc w:val="left"/>
             </w:pPr>
             <w:r>
-              <w:t xml:space="preserve">186.821 USD</w:t>
+              <w:t xml:space="preserve">186.868 USD</w:t>
             </w:r>
           </w:p>
         </w:tc>
@@ -18838,7 +18838,7 @@
               <w:jc w:val="left"/>
             </w:pPr>
             <w:r>
-              <w:t xml:space="preserve">338.520 USD</w:t>
+              <w:t xml:space="preserve">338.567 USD</w:t>
             </w:r>
           </w:p>
         </w:tc>
@@ -25840,7 +25840,7 @@
         <w:t xml:space="preserve"> </w:t>
       </w:r>
       <w:r>
-        <w:t xml:space="preserve">coste real de la rotura se sitúa entre 186.821 y 338.520 dólares frente a los 164.496</w:t>
+        <w:t xml:space="preserve">coste real de la rotura se sitúa entre 186.868 y 338.567 dólares frente a los 164.543</w:t>
       </w:r>
       <w:r>
         <w:t xml:space="preserve"> </w:t>

</xml_diff>

<commit_message>
Reconciliacion del notebook 03 con la memoria, caches sin grupos y figuras
</commit_message>
<xml_diff>
--- a/memoria/Memoria_DSMarket.docx
+++ b/memoria/Memoria_DSMarket.docx
@@ -414,7 +414,7 @@
         <w:t xml:space="preserve"> </w:t>
       </w:r>
       <w:r>
-        <w:t xml:space="preserve">WRMSSE de 1,0407 (0,9994 en la última ventana con el modelo final de 400 días de historia), y la estrategia de horizonte resulta unas diez veces más influyente que la</w:t>
+        <w:t xml:space="preserve">WRMSSE de 1,0422 (1,0002 en la última ventana con el modelo final de 400 días de historia), y la estrategia de horizonte resulta unas tres veces más influyente que la</w:t>
       </w:r>
       <w:r>
         <w:t xml:space="preserve"> </w:t>
@@ -5707,13 +5707,13 @@
         <w:t xml:space="preserve">400 días</w:t>
       </w:r>
       <w:r>
-        <w:t xml:space="preserve">, que incluyen el año anterior completo: el error mejora un 5,7 % en diciembre y</w:t>
-      </w:r>
-      <w:r>
-        <w:t xml:space="preserve"> </w:t>
-      </w:r>
-      <w:r>
-        <w:t xml:space="preserve">un 3,4 % en noviembre sin empeorar el resto del año. El</w:t>
+        <w:t xml:space="preserve">, que incluyen el año anterior completo: el error mejora un 5,3 % en diciembre y</w:t>
+      </w:r>
+      <w:r>
+        <w:t xml:space="preserve"> </w:t>
+      </w:r>
+      <w:r>
+        <w:t xml:space="preserve">un 3,2 % en noviembre sin empeorar el resto del año. El</w:t>
       </w:r>
       <w:r>
         <w:t xml:space="preserve"> </w:t>
@@ -8707,18 +8707,6 @@
       <w:r>
         <w:t xml:space="preserve">facturación. Con ellas se asignó a cada grupo un nombre que describe su comportamiento de compra (ritmo de venta, momento de compra o precio), ya que la segmentación se hizo por comportamiento y no por categoría; la categoría predominante se indica solo como contexto en la descripción.</w:t>
       </w:r>
-      <w:r>
-        <w:t xml:space="preserve"/>
-      </w:r>
-      <w:r>
-        <w:t xml:space="preserve"/>
-      </w:r>
-      <w:r>
-        <w:t xml:space="preserve"/>
-      </w:r>
-      <w:r>
-        <w:t xml:space="preserve"/>
-      </w:r>
     </w:p>
     <w:tbl>
       <w:tblPr>
@@ -9548,18 +9536,6 @@
       <w:r>
         <w:t xml:space="preserve">La lectura de negocio es que el perfil de una tienda no viene determinado por su ciudad. Para una apertura, la referencia de surtido y de previsión inicial debería ser la tienda existente que se espere más parecida (por tipo de zona y de clientela), no la media de su ciudad.</w:t>
       </w:r>
-      <w:r>
-        <w:t xml:space="preserve"/>
-      </w:r>
-      <w:r>
-        <w:t xml:space="preserve"/>
-      </w:r>
-      <w:r>
-        <w:t xml:space="preserve"/>
-      </w:r>
-      <w:r>
-        <w:t xml:space="preserve"/>
-      </w:r>
     </w:p>
     <w:p>
       <w:pPr>
@@ -10251,18 +10227,6 @@
       <w:r>
         <w:t xml:space="preserve">estructura necesaria para modelar. El grupo de producto se probó como variable del modelo de predicción y no mejoró la precisión, por lo que se usa para describir el error por tipo de producto; la clase XYZ determina más adelante qué método de reposición se aplica a cada serie.</w:t>
       </w:r>
-      <w:r>
-        <w:t xml:space="preserve"/>
-      </w:r>
-      <w:r>
-        <w:t xml:space="preserve"/>
-      </w:r>
-      <w:r>
-        <w:t xml:space="preserve"/>
-      </w:r>
-      <w:r>
-        <w:t xml:space="preserve"/>
-      </w:r>
     </w:p>
     <w:p>
       <w:pPr>
@@ -10548,7 +10512,7 @@
         <w:t xml:space="preserve"> </w:t>
       </w:r>
       <w:r>
-        <w:t xml:space="preserve">1,0626 frente a 1,0657, un empate técnico. XGBoost queda en 1,0631. La razón no es un mal ajuste,</w:t>
+        <w:t xml:space="preserve">1,0639 frente a 1,0657, un empate técnico. XGBoost queda en 1,0570, un 0,8 % por debajo de la media móvil. La razón no es un mal ajuste,</w:t>
       </w:r>
       <w:r>
         <w:t xml:space="preserve"> </w:t>
@@ -10659,7 +10623,7 @@
               <w:rPr>
                 <w:b/>
               </w:rPr>
-              <w:t xml:space="preserve">LightGBM, bloques semanales</w:t>
+              <w:t xml:space="preserve">XGBoost, bloques semanales</w:t>
             </w:r>
           </w:p>
         </w:tc>
@@ -10673,7 +10637,7 @@
               <w:rPr>
                 <w:b/>
               </w:rPr>
-              <w:t xml:space="preserve">1,0407</w:t>
+              <w:t xml:space="preserve">1,0352</w:t>
             </w:r>
           </w:p>
         </w:tc>
@@ -10686,18 +10650,18 @@
               <w:jc w:val="left"/>
             </w:pPr>
             <w:r>
-              <w:t xml:space="preserve">XGBoost, bloques semanales</w:t>
-            </w:r>
-          </w:p>
-        </w:tc>
-        <w:tc>
-          <w:p>
-            <w:pPr>
-              <w:pStyle w:val="Compact"/>
-              <w:jc w:val="left"/>
-            </w:pPr>
-            <w:r>
-              <w:t xml:space="preserve">1,0430</w:t>
+              <w:t xml:space="preserve">LightGBM, bloques semanales</w:t>
+            </w:r>
+          </w:p>
+        </w:tc>
+        <w:tc>
+          <w:p>
+            <w:pPr>
+              <w:pStyle w:val="Compact"/>
+              <w:jc w:val="left"/>
+            </w:pPr>
+            <w:r>
+              <w:t xml:space="preserve">1,0422</w:t>
             </w:r>
           </w:p>
         </w:tc>
@@ -10710,18 +10674,18 @@
               <w:jc w:val="left"/>
             </w:pPr>
             <w:r>
-              <w:t xml:space="preserve">LightGBM, modelo único</w:t>
-            </w:r>
-          </w:p>
-        </w:tc>
-        <w:tc>
-          <w:p>
-            <w:pPr>
-              <w:pStyle w:val="Compact"/>
-              <w:jc w:val="left"/>
-            </w:pPr>
-            <w:r>
-              <w:t xml:space="preserve">1,0626</w:t>
+              <w:t xml:space="preserve">XGBoost, modelo único</w:t>
+            </w:r>
+          </w:p>
+        </w:tc>
+        <w:tc>
+          <w:p>
+            <w:pPr>
+              <w:pStyle w:val="Compact"/>
+              <w:jc w:val="left"/>
+            </w:pPr>
+            <w:r>
+              <w:t xml:space="preserve">1,0570</w:t>
             </w:r>
           </w:p>
         </w:tc>
@@ -10734,18 +10698,18 @@
               <w:jc w:val="left"/>
             </w:pPr>
             <w:r>
-              <w:t xml:space="preserve">XGBoost, modelo único</w:t>
-            </w:r>
-          </w:p>
-        </w:tc>
-        <w:tc>
-          <w:p>
-            <w:pPr>
-              <w:pStyle w:val="Compact"/>
-              <w:jc w:val="left"/>
-            </w:pPr>
-            <w:r>
-              <w:t xml:space="preserve">1,0631</w:t>
+              <w:t xml:space="preserve">LightGBM, modelo único</w:t>
+            </w:r>
+          </w:p>
+        </w:tc>
+        <w:tc>
+          <w:p>
+            <w:pPr>
+              <w:pStyle w:val="Compact"/>
+              <w:jc w:val="left"/>
+            </w:pPr>
+            <w:r>
+              <w:t xml:space="preserve">1,0639</w:t>
             </w:r>
           </w:p>
         </w:tc>
@@ -10922,28 +10886,40 @@
         <w:rPr>
           <w:b/>
         </w:rPr>
-        <w:t xml:space="preserve">mejora un 2 % el mismo algoritmo (de 1,0626 a 1,0407), mientras que la diferencia entre LightGBM y</w:t>
-      </w:r>
-      <w:r>
-        <w:rPr>
-          <w:b/>
-        </w:rPr>
-        <w:t xml:space="preserve"> </w:t>
-      </w:r>
-      <w:r>
-        <w:rPr>
-          <w:b/>
-        </w:rPr>
-        <w:t xml:space="preserve">XGBoost con la misma estrategia es de 0,002</w:t>
-      </w:r>
-      <w:r>
-        <w:t xml:space="preserve">. Definir qué información puede ver el modelo rinde</w:t>
-      </w:r>
-      <w:r>
-        <w:t xml:space="preserve"> </w:t>
-      </w:r>
-      <w:r>
-        <w:t xml:space="preserve">aproximadamente diez veces más que elegir la biblioteca. Se adopta LightGBM con bloques semanales.</w:t>
+        <w:t xml:space="preserve">mejora un 2 % el mismo algoritmo (de 1,0639 a 1,0422 en LightGBM y de 1,0570 a 1,0352 en XGBoost), mientras que la</w:t>
+      </w:r>
+      <w:r>
+        <w:rPr>
+          <w:b/>
+        </w:rPr>
+        <w:t xml:space="preserve"> </w:t>
+      </w:r>
+      <w:r>
+        <w:rPr>
+          <w:b/>
+        </w:rPr>
+        <w:t xml:space="preserve">diferencia entre ambas bibliotecas con la misma estrategia es de 0,007 (0,7 %)</w:t>
+      </w:r>
+      <w:r>
+        <w:t xml:space="preserve">. Definir qué información puede ver el</w:t>
+      </w:r>
+      <w:r>
+        <w:t xml:space="preserve"> </w:t>
+      </w:r>
+      <w:r>
+        <w:t xml:space="preserve">modelo rinde unas tres veces más que elegir la biblioteca. XGBoost queda ligeramente por delante en las cuatro</w:t>
+      </w:r>
+      <w:r>
+        <w:t xml:space="preserve"> </w:t>
+      </w:r>
+      <w:r>
+        <w:t xml:space="preserve">métricas; se adopta LightGBM con bloques semanales porque todo el desarrollo posterior (400 días, eventos semanales,</w:t>
+      </w:r>
+      <w:r>
+        <w:t xml:space="preserve"> </w:t>
+      </w:r>
+      <w:r>
+        <w:t xml:space="preserve">modelo cuantílico y entrega) se construyó sobre él, y evaluar XGBoost en el modelo final queda como línea de mejora.</w:t>
       </w:r>
     </w:p>
     <w:p>
@@ -10957,7 +10933,7 @@
         <w:t xml:space="preserve"> </w:t>
       </w:r>
       <w:r>
-        <w:t xml:space="preserve">los modelos (1,0401 frente a 1,0450 de LightGBM), porque el MAE trata igual a todos los productos y</w:t>
+        <w:t xml:space="preserve">los modelos (1,0401 frente a 1,0462 de LightGBM y 1,0349 de XGBoost), porque el MAE trata igual a todos los productos y</w:t>
       </w:r>
       <w:r>
         <w:t xml:space="preserve"> </w:t>
@@ -11105,7 +11081,7 @@
         <w:rPr>
           <w:b/>
         </w:rPr>
-        <w:t xml:space="preserve">58,2 %</w:t>
+        <w:t xml:space="preserve">54,1 %</w:t>
       </w:r>
       <w:r>
         <w:t xml:space="preserve"> </w:t>
@@ -11126,10 +11102,10 @@
         <w:rPr>
           <w:b/>
         </w:rPr>
-        <w:t xml:space="preserve">86,2 %</w:t>
-      </w:r>
-      <w:r>
-        <w:t xml:space="preserve">. El identificador del producto pesa un 7,5 %, y</w:t>
+        <w:t xml:space="preserve">88,1 %</w:t>
+      </w:r>
+      <w:r>
+        <w:t xml:space="preserve">. El identificador del producto pesa un 6,0 %, y</w:t>
       </w:r>
       <w:r>
         <w:t xml:space="preserve"> </w:t>
@@ -11141,19 +11117,13 @@
         <w:t xml:space="preserve"> </w:t>
       </w:r>
       <w:r>
-        <w:t xml:space="preserve">aporta un</w:t>
-      </w:r>
-      <w:r>
-        <w:t xml:space="preserve"> </w:t>
-      </w:r>
-      <w:r>
-        <w:rPr>
-          <w:b/>
-        </w:rPr>
-        <w:t xml:space="preserve">0,16 %</w:t>
-      </w:r>
-      <w:r>
-        <w:t xml:space="preserve">: su papel es de interpretación, no de precisión. La lectura es que el modelo</w:t>
+        <w:t xml:space="preserve">no se incluye como variable: en el experimento con y sin él pesaba un 0,18 % de la importancia y no</w:t>
+      </w:r>
+      <w:r>
+        <w:t xml:space="preserve"> </w:t>
+      </w:r>
+      <w:r>
+        <w:t xml:space="preserve">mejoraba la predicción (cuaderno 03b); su papel es de interpretación, no de precisión. La lectura es que el modelo</w:t>
       </w:r>
       <w:r>
         <w:t xml:space="preserve"> </w:t>
@@ -11175,7 +11145,7 @@
       <w:r>
         <w:drawing>
           <wp:inline>
-            <wp:extent cx="5334000" cy="2977823"/>
+            <wp:extent cx="5334000" cy="2985122"/>
             <wp:effectExtent b="0" l="0" r="0" t="0"/>
             <wp:docPr descr="Figura 7.12. Importancia de las variables del modelo de bloques semanales (media de los tres pliegues). Fuente: elaboración propia." title="" id="1" name="Picture"/>
             <a:graphic>
@@ -11196,7 +11166,7 @@
                   <pic:spPr bwMode="auto">
                     <a:xfrm>
                       <a:off x="0" y="0"/>
-                      <a:ext cx="5334000" cy="2977823"/>
+                      <a:ext cx="5334000" cy="2985122"/>
                     </a:xfrm>
                     <a:prstGeom prst="rect">
                       <a:avLst/>
@@ -11440,18 +11410,18 @@
               <w:jc w:val="left"/>
             </w:pPr>
             <w:r>
-              <w:t xml:space="preserve">1,0768</w:t>
-            </w:r>
-          </w:p>
-        </w:tc>
-        <w:tc>
-          <w:p>
-            <w:pPr>
-              <w:pStyle w:val="Compact"/>
-              <w:jc w:val="left"/>
-            </w:pPr>
-            <w:r>
-              <w:t xml:space="preserve">1,0518</w:t>
+              <w:t xml:space="preserve">1,0759</w:t>
+            </w:r>
+          </w:p>
+        </w:tc>
+        <w:tc>
+          <w:p>
+            <w:pPr>
+              <w:pStyle w:val="Compact"/>
+              <w:jc w:val="left"/>
+            </w:pPr>
+            <w:r>
+              <w:t xml:space="preserve">1,0517</w:t>
             </w:r>
           </w:p>
         </w:tc>
@@ -11473,7 +11443,7 @@
               <w:jc w:val="left"/>
             </w:pPr>
             <w:r>
-              <w:t xml:space="preserve">1,0490</w:t>
+              <w:t xml:space="preserve">1,0487</w:t>
             </w:r>
           </w:p>
         </w:tc>
@@ -11486,51 +11456,51 @@
               <w:jc w:val="left"/>
             </w:pPr>
             <w:r>
-              <w:t xml:space="preserve">LightGBM pequeño (8 variables, 15 hojas)</w:t>
-            </w:r>
-          </w:p>
-        </w:tc>
-        <w:tc>
-          <w:p>
-            <w:pPr>
-              <w:pStyle w:val="Compact"/>
-              <w:jc w:val="left"/>
-            </w:pPr>
-            <w:r>
-              <w:t xml:space="preserve">1,0827</w:t>
-            </w:r>
-          </w:p>
-        </w:tc>
-        <w:tc>
-          <w:p>
-            <w:pPr>
-              <w:pStyle w:val="Compact"/>
-              <w:jc w:val="left"/>
-            </w:pPr>
-            <w:r>
-              <w:t xml:space="preserve">1,0380</w:t>
-            </w:r>
-          </w:p>
-        </w:tc>
-        <w:tc>
-          <w:p>
-            <w:pPr>
-              <w:pStyle w:val="Compact"/>
-              <w:jc w:val="left"/>
-            </w:pPr>
-            <w:r>
-              <w:t xml:space="preserve">1,0095</w:t>
-            </w:r>
-          </w:p>
-        </w:tc>
-        <w:tc>
-          <w:p>
-            <w:pPr>
-              <w:pStyle w:val="Compact"/>
-              <w:jc w:val="left"/>
-            </w:pPr>
-            <w:r>
-              <w:t xml:space="preserve">1,0434</w:t>
+              <w:t xml:space="preserve">LightGBM pequeño (7 variables, 15 hojas)</w:t>
+            </w:r>
+          </w:p>
+        </w:tc>
+        <w:tc>
+          <w:p>
+            <w:pPr>
+              <w:pStyle w:val="Compact"/>
+              <w:jc w:val="left"/>
+            </w:pPr>
+            <w:r>
+              <w:t xml:space="preserve">1,0857</w:t>
+            </w:r>
+          </w:p>
+        </w:tc>
+        <w:tc>
+          <w:p>
+            <w:pPr>
+              <w:pStyle w:val="Compact"/>
+              <w:jc w:val="left"/>
+            </w:pPr>
+            <w:r>
+              <w:t xml:space="preserve">1,0407</w:t>
+            </w:r>
+          </w:p>
+        </w:tc>
+        <w:tc>
+          <w:p>
+            <w:pPr>
+              <w:pStyle w:val="Compact"/>
+              <w:jc w:val="left"/>
+            </w:pPr>
+            <w:r>
+              <w:t xml:space="preserve">1,0098</w:t>
+            </w:r>
+          </w:p>
+        </w:tc>
+        <w:tc>
+          <w:p>
+            <w:pPr>
+              <w:pStyle w:val="Compact"/>
+              <w:jc w:val="left"/>
+            </w:pPr>
+            <w:r>
+              <w:t xml:space="preserve">1,0454</w:t>
             </w:r>
           </w:p>
         </w:tc>
@@ -11554,40 +11524,40 @@
               <w:jc w:val="left"/>
             </w:pPr>
             <w:r>
-              <w:t xml:space="preserve">1,0776</w:t>
-            </w:r>
-          </w:p>
-        </w:tc>
-        <w:tc>
-          <w:p>
-            <w:pPr>
-              <w:pStyle w:val="Compact"/>
-              <w:jc w:val="left"/>
-            </w:pPr>
-            <w:r>
-              <w:t xml:space="preserve">1,0415</w:t>
-            </w:r>
-          </w:p>
-        </w:tc>
-        <w:tc>
-          <w:p>
-            <w:pPr>
-              <w:pStyle w:val="Compact"/>
-              <w:jc w:val="left"/>
-            </w:pPr>
-            <w:r>
-              <w:t xml:space="preserve">1,0029</w:t>
-            </w:r>
-          </w:p>
-        </w:tc>
-        <w:tc>
-          <w:p>
-            <w:pPr>
-              <w:pStyle w:val="Compact"/>
-              <w:jc w:val="left"/>
-            </w:pPr>
-            <w:r>
-              <w:t xml:space="preserve">1,0407</w:t>
+              <w:t xml:space="preserve">1,0799</w:t>
+            </w:r>
+          </w:p>
+        </w:tc>
+        <w:tc>
+          <w:p>
+            <w:pPr>
+              <w:pStyle w:val="Compact"/>
+              <w:jc w:val="left"/>
+            </w:pPr>
+            <w:r>
+              <w:t xml:space="preserve">1,0410</w:t>
+            </w:r>
+          </w:p>
+        </w:tc>
+        <w:tc>
+          <w:p>
+            <w:pPr>
+              <w:pStyle w:val="Compact"/>
+              <w:jc w:val="left"/>
+            </w:pPr>
+            <w:r>
+              <w:t xml:space="preserve">1,0055</w:t>
+            </w:r>
+          </w:p>
+        </w:tc>
+        <w:tc>
+          <w:p>
+            <w:pPr>
+              <w:pStyle w:val="Compact"/>
+              <w:jc w:val="left"/>
+            </w:pPr>
+            <w:r>
+              <w:t xml:space="preserve">1,0422</w:t>
             </w:r>
           </w:p>
         </w:tc>
@@ -11633,7 +11603,7 @@
               <w:jc w:val="left"/>
             </w:pPr>
             <w:r>
-              <w:t xml:space="preserve">0,9994</w:t>
+              <w:t xml:space="preserve">1,0002</w:t>
             </w:r>
           </w:p>
         </w:tc>
@@ -11655,13 +11625,13 @@
         <w:pStyle w:val="BodyText"/>
       </w:pPr>
       <w:r>
-        <w:t xml:space="preserve">El escalón más rentable es multiplicar la media móvil por un factor de día de la semana y grupo de</w:t>
-      </w:r>
-      <w:r>
-        <w:t xml:space="preserve"> </w:t>
-      </w:r>
-      <w:r>
-        <w:t xml:space="preserve">producto (reduce el WRMSSE entre un 1,3 % y un 2,1 %) sin ningún aprendizaje automático. El</w:t>
+        <w:t xml:space="preserve">El escalón más rentable es multiplicar la media móvil por un factor de día de la semana y departamento</w:t>
+      </w:r>
+      <w:r>
+        <w:t xml:space="preserve"> </w:t>
+      </w:r>
+      <w:r>
+        <w:t xml:space="preserve">(reduce el WRMSSE entre un 1,3 % y un 2,1 %) sin ningún aprendizaje automático. El</w:t>
       </w:r>
       <w:r>
         <w:t xml:space="preserve"> </w:t>
@@ -11673,7 +11643,7 @@
         <w:t xml:space="preserve"> </w:t>
       </w:r>
       <w:r>
-        <w:t xml:space="preserve">aporta entre −0,1 % y 1,5 % sobre la media móvil por día de la semana; su justificación está en la</w:t>
+        <w:t xml:space="preserve">aporta entre −0,4 % y 1,3 % sobre la media móvil por día de la semana; su justificación está en la</w:t>
       </w:r>
       <w:r>
         <w:t xml:space="preserve"> </w:t>
@@ -11762,16 +11732,16 @@
         <w:t xml:space="preserve"> </w:t>
       </w:r>
       <w:r>
-        <w:t xml:space="preserve">WRMSSE es de 1,0520 en noviembre y de</w:t>
-      </w:r>
-      <w:r>
-        <w:t xml:space="preserve"> </w:t>
-      </w:r>
-      <w:r>
-        <w:rPr>
-          <w:b/>
-        </w:rPr>
-        <w:t xml:space="preserve">1,1119 en diciembre</w:t>
+        <w:t xml:space="preserve">WRMSSE es de 1,0542 en noviembre y de</w:t>
+      </w:r>
+      <w:r>
+        <w:t xml:space="preserve"> </w:t>
+      </w:r>
+      <w:r>
+        <w:rPr>
+          <w:b/>
+        </w:rPr>
+        <w:t xml:space="preserve">1,1090 en diciembre</w:t>
       </w:r>
       <w:r>
         <w:t xml:space="preserve">, y la ventaja sobre la media móvil</w:t>
@@ -11795,7 +11765,7 @@
         <w:rPr>
           <w:b/>
         </w:rPr>
-        <w:t xml:space="preserve">36.118 unidades frente a 14 reales</w:t>
+        <w:t xml:space="preserve">35.966 unidades frente a 14 reales</w:t>
       </w:r>
       <w:r>
         <w:t xml:space="preserve"> </w:t>
@@ -11807,7 +11777,7 @@
         <w:t xml:space="preserve"> </w:t>
       </w:r>
       <w:r>
-        <w:t xml:space="preserve">los días 22 a 24 (−17 %, −23 % y −22 %) y subestimó el 31 de diciembre en un 29 %.</w:t>
+        <w:t xml:space="preserve">los días 22 a 24 (−17 %, −23 % y −21 %) y subestimó el 31 de diciembre en un 28 %.</w:t>
       </w:r>
     </w:p>
     <w:p>
@@ -11872,13 +11842,13 @@
         <w:t xml:space="preserve"> </w:t>
       </w:r>
       <w:r>
-        <w:t xml:space="preserve">faltan o han pasado). Con 180 días de historia no aportan nada: pesan un 0,17 % de la importancia</w:t>
-      </w:r>
-      <w:r>
-        <w:t xml:space="preserve"> </w:t>
-      </w:r>
-      <w:r>
-        <w:t xml:space="preserve">y las diferencias son de una o dos milésimas.</w:t>
+        <w:t xml:space="preserve">faltan o han pasado). Con 180 días de historia no aportan nada: pesan un 0,15 % de la importancia</w:t>
+      </w:r>
+      <w:r>
+        <w:t xml:space="preserve"> </w:t>
+      </w:r>
+      <w:r>
+        <w:t xml:space="preserve">y las diferencias son de unas pocas milésimas (0,004 como máximo).</w:t>
       </w:r>
     </w:p>
     <w:p>
@@ -12007,7 +11977,18 @@
               <w:jc w:val="left"/>
             </w:pPr>
             <w:r>
-              <w:t xml:space="preserve">1,0520</w:t>
+              <w:t xml:space="preserve">1,0542</w:t>
+            </w:r>
+          </w:p>
+        </w:tc>
+        <w:tc>
+          <w:p>
+            <w:pPr>
+              <w:pStyle w:val="Compact"/>
+              <w:jc w:val="left"/>
+            </w:pPr>
+            <w:r>
+              <w:t xml:space="preserve">1,0205</w:t>
             </w:r>
           </w:p>
         </w:tc>
@@ -12021,7 +12002,42 @@
               <w:rPr>
                 <w:b/>
               </w:rPr>
-              <w:t xml:space="preserve">1,0177</w:t>
+              <w:t xml:space="preserve">1,0156</w:t>
+            </w:r>
+          </w:p>
+        </w:tc>
+      </w:tr>
+      <w:tr>
+        <w:tc>
+          <w:p>
+            <w:pPr>
+              <w:pStyle w:val="Compact"/>
+              <w:jc w:val="left"/>
+            </w:pPr>
+            <w:r>
+              <w:t xml:space="preserve">Diciembre 2015</w:t>
+            </w:r>
+          </w:p>
+        </w:tc>
+        <w:tc>
+          <w:p>
+            <w:pPr>
+              <w:pStyle w:val="Compact"/>
+              <w:jc w:val="left"/>
+            </w:pPr>
+            <w:r>
+              <w:t xml:space="preserve">1,1090</w:t>
+            </w:r>
+          </w:p>
+        </w:tc>
+        <w:tc>
+          <w:p>
+            <w:pPr>
+              <w:pStyle w:val="Compact"/>
+              <w:jc w:val="left"/>
+            </w:pPr>
+            <w:r>
+              <w:t xml:space="preserve">1,0504</w:t>
             </w:r>
           </w:p>
         </w:tc>
@@ -12035,7 +12051,7 @@
               <w:rPr>
                 <w:b/>
               </w:rPr>
-              <w:t xml:space="preserve">1,0177</w:t>
+              <w:t xml:space="preserve">1,0469</w:t>
             </w:r>
           </w:p>
         </w:tc>
@@ -12048,29 +12064,18 @@
               <w:jc w:val="left"/>
             </w:pPr>
             <w:r>
-              <w:t xml:space="preserve">Diciembre 2015</w:t>
-            </w:r>
-          </w:p>
-        </w:tc>
-        <w:tc>
-          <w:p>
-            <w:pPr>
-              <w:pStyle w:val="Compact"/>
-              <w:jc w:val="left"/>
-            </w:pPr>
-            <w:r>
-              <w:t xml:space="preserve">1,1119</w:t>
-            </w:r>
-          </w:p>
-        </w:tc>
-        <w:tc>
-          <w:p>
-            <w:pPr>
-              <w:pStyle w:val="Compact"/>
-              <w:jc w:val="left"/>
-            </w:pPr>
-            <w:r>
-              <w:t xml:space="preserve">1,0497</w:t>
+              <w:t xml:space="preserve">Media febrero-abril 2016</w:t>
+            </w:r>
+          </w:p>
+        </w:tc>
+        <w:tc>
+          <w:p>
+            <w:pPr>
+              <w:pStyle w:val="Compact"/>
+              <w:jc w:val="left"/>
+            </w:pPr>
+            <w:r>
+              <w:t xml:space="preserve">1,0422</w:t>
             </w:r>
           </w:p>
         </w:tc>
@@ -12084,56 +12089,18 @@
               <w:rPr>
                 <w:b/>
               </w:rPr>
-              <w:t xml:space="preserve">1,0484</w:t>
-            </w:r>
-          </w:p>
-        </w:tc>
-      </w:tr>
-      <w:tr>
-        <w:tc>
-          <w:p>
-            <w:pPr>
-              <w:pStyle w:val="Compact"/>
-              <w:jc w:val="left"/>
-            </w:pPr>
-            <w:r>
-              <w:t xml:space="preserve">Media febrero-abril 2016</w:t>
-            </w:r>
-          </w:p>
-        </w:tc>
-        <w:tc>
-          <w:p>
-            <w:pPr>
-              <w:pStyle w:val="Compact"/>
-              <w:jc w:val="left"/>
-            </w:pPr>
-            <w:r>
-              <w:t xml:space="preserve">1,0407</w:t>
-            </w:r>
-          </w:p>
-        </w:tc>
-        <w:tc>
-          <w:p>
-            <w:pPr>
-              <w:pStyle w:val="Compact"/>
-              <w:jc w:val="left"/>
-            </w:pPr>
-            <w:r>
-              <w:t xml:space="preserve">1,0382</w:t>
-            </w:r>
-          </w:p>
-        </w:tc>
-        <w:tc>
-          <w:p>
-            <w:pPr>
-              <w:pStyle w:val="Compact"/>
-              <w:jc w:val="left"/>
-            </w:pPr>
-            <w:r>
-              <w:rPr>
-                <w:b/>
-              </w:rPr>
-              <w:t xml:space="preserve">1,0378</w:t>
+              <w:t xml:space="preserve">1,0373</w:t>
+            </w:r>
+          </w:p>
+        </w:tc>
+        <w:tc>
+          <w:p>
+            <w:pPr>
+              <w:pStyle w:val="Compact"/>
+              <w:jc w:val="left"/>
+            </w:pPr>
+            <w:r>
+              <w:t xml:space="preserve">1,0381</w:t>
             </w:r>
           </w:p>
         </w:tc>
@@ -12153,7 +12120,7 @@
         <w:rPr>
           <w:b/>
         </w:rPr>
-        <w:t xml:space="preserve">5,7 %</w:t>
+        <w:t xml:space="preserve">5,3 %</w:t>
       </w:r>
       <w:r>
         <w:t xml:space="preserve"> </w:t>
@@ -12168,16 +12135,25 @@
         <w:rPr>
           <w:b/>
         </w:rPr>
-        <w:t xml:space="preserve">3,3 %</w:t>
-      </w:r>
-      <w:r>
-        <w:t xml:space="preserve">, y el resto del año no empeora. Casi toda la</w:t>
-      </w:r>
-      <w:r>
-        <w:t xml:space="preserve"> </w:t>
-      </w:r>
-      <w:r>
-        <w:t xml:space="preserve">mejora procede de la historia adicional; las variables semanales añaden un 0,1 % en diciembre. Con</w:t>
+        <w:t xml:space="preserve">3,2 %</w:t>
+      </w:r>
+      <w:r>
+        <w:t xml:space="preserve"> </w:t>
+      </w:r>
+      <w:r>
+        <w:t xml:space="preserve">solo por la historia (5,6 % y 3,7 % con los eventos</w:t>
+      </w:r>
+      <w:r>
+        <w:t xml:space="preserve"> </w:t>
+      </w:r>
+      <w:r>
+        <w:t xml:space="preserve">semanales), y el resto del año no empeora. Casi toda la mejora procede de la historia adicional; las variables</w:t>
+      </w:r>
+      <w:r>
+        <w:t xml:space="preserve"> </w:t>
+      </w:r>
+      <w:r>
+        <w:t xml:space="preserve">semanales añaden entre un 0,3 % y un 0,5 % en temporada alta y restan un 0,1 % en febrero-abril. Con</w:t>
       </w:r>
       <w:r>
         <w:t xml:space="preserve"> </w:t>
@@ -12195,19 +12171,19 @@
         <w:t xml:space="preserve">aprende por sí solo el cierre</w:t>
       </w:r>
       <w:r>
-        <w:t xml:space="preserve">: predice 123 unidades para el 25 de diciembre</w:t>
-      </w:r>
-      <w:r>
-        <w:t xml:space="preserve"> </w:t>
-      </w:r>
-      <w:r>
-        <w:t xml:space="preserve">de 2015 frente a 14 reales (antes, unas 36.000), la semana del 18 al 24 pasa de un error del −10,1 %</w:t>
-      </w:r>
-      <w:r>
-        <w:t xml:space="preserve"> </w:t>
-      </w:r>
-      <w:r>
-        <w:t xml:space="preserve">al −6,2 %, y la semana de Black Friday de +10,3 % a +0,2 %. El pico del 31 de diciembre sigue sin</w:t>
+        <w:t xml:space="preserve">: predice 161 unidades para el 25 de diciembre</w:t>
+      </w:r>
+      <w:r>
+        <w:t xml:space="preserve"> </w:t>
+      </w:r>
+      <w:r>
+        <w:t xml:space="preserve">de 2015 frente a 14 reales (antes, unas 36.000), la semana del 18 al 24 pasa de un error del −9,7 %</w:t>
+      </w:r>
+      <w:r>
+        <w:t xml:space="preserve"> </w:t>
+      </w:r>
+      <w:r>
+        <w:t xml:space="preserve">al −5,2 %, y la semana de Black Friday de +9,5 % a +0,3 %. El pico del 31 de diciembre sigue sin</w:t>
       </w:r>
       <w:r>
         <w:t xml:space="preserve"> </w:t>
@@ -12375,7 +12351,7 @@
         <w:rPr>
           <w:b/>
         </w:rPr>
-        <w:t xml:space="preserve">cobertura empírica del percentil 90 fue del 90,0 %</w:t>
+        <w:t xml:space="preserve">cobertura empírica del percentil 90 fue del 89,4 %</w:t>
       </w:r>
       <w:r>
         <w:t xml:space="preserve"> </w:t>
@@ -12387,7 +12363,7 @@
         <w:t xml:space="preserve"> </w:t>
       </w:r>
       <w:r>
-        <w:t xml:space="preserve">a un objetivo del 90 %, con una pérdida pinball de 0,3101 frente a 0,5297 si se usara la predicción</w:t>
+        <w:t xml:space="preserve">a un objetivo del 90 %, con una pérdida pinball de 0,3059 frente a 0,5266 si se usara la predicción</w:t>
       </w:r>
       <w:r>
         <w:t xml:space="preserve"> </w:t>
@@ -12402,7 +12378,7 @@
         <w:rPr>
           <w:b/>
         </w:rPr>
-        <w:t xml:space="preserve">67,9 %</w:t>
+        <w:t xml:space="preserve">67,7 %</w:t>
       </w:r>
       <w:r>
         <w:t xml:space="preserve"> </w:t>
@@ -12541,13 +12517,13 @@
         <w:rPr>
           <w:b/>
         </w:rPr>
-        <w:t xml:space="preserve">127 % más de inventario</w:t>
-      </w:r>
-      <w:r>
-        <w:t xml:space="preserve"> </w:t>
-      </w:r>
-      <w:r>
-        <w:t xml:space="preserve">(2.629.378 unidades frente a 1.160.682 para las mismas cuatro</w:t>
+        <w:t xml:space="preserve">128 % más de inventario</w:t>
+      </w:r>
+      <w:r>
+        <w:t xml:space="preserve"> </w:t>
+      </w:r>
+      <w:r>
+        <w:t xml:space="preserve">(2.630.372 unidades frente a 1.151.452 para las mismas cuatro</w:t>
       </w:r>
       <w:r>
         <w:t xml:space="preserve"> </w:t>
@@ -12650,7 +12626,7 @@
         <w:pStyle w:val="FirstParagraph"/>
       </w:pPr>
       <w:r>
-        <w:t xml:space="preserve">El modelo subestima de forma sistemática (un 1,9 % en la última ventana). Se examinó si un factor</w:t>
+        <w:t xml:space="preserve">El modelo subestima de forma sistemática (un 1,8 % en la última ventana). Se examinó si un factor</w:t>
       </w:r>
       <w:r>
         <w:t xml:space="preserve"> </w:t>
@@ -12665,7 +12641,7 @@
         <w:rPr>
           <w:b/>
         </w:rPr>
-        <w:t xml:space="preserve">1,0733, 1,0255 y 1,0198</w:t>
+        <w:t xml:space="preserve">1,0733, 1,0251 y 1,0186</w:t>
       </w:r>
       <w:r>
         <w:t xml:space="preserve">:</w:t>
@@ -12680,19 +12656,19 @@
         <w:t xml:space="preserve"> </w:t>
       </w:r>
       <w:r>
-        <w:t xml:space="preserve">pliegues (1,0494) sobrecorrige: el sesgo del último pliegue pasa de −1,94 % a +2,91 % y el WRMSSE y</w:t>
-      </w:r>
-      <w:r>
-        <w:t xml:space="preserve"> </w:t>
-      </w:r>
-      <w:r>
-        <w:t xml:space="preserve">el MAE empeoran. Calibrar con el pliegue más reciente (1,0255) lo deja en +0,56 % con el WRMSSE</w:t>
-      </w:r>
-      <w:r>
-        <w:t xml:space="preserve"> </w:t>
-      </w:r>
-      <w:r>
-        <w:t xml:space="preserve">prácticamente intacto (1,0029 a 1,0034).</w:t>
+        <w:t xml:space="preserve">pliegues (1,0492) sobrecorrige: el sesgo del último pliegue pasa de −1,83 % a +3,00 % y el WRMSSE y</w:t>
+      </w:r>
+      <w:r>
+        <w:t xml:space="preserve"> </w:t>
+      </w:r>
+      <w:r>
+        <w:t xml:space="preserve">el MAE empeoran. Calibrar con el pliegue más reciente (1,0251) lo deja en +0,63 % con el WRMSSE</w:t>
+      </w:r>
+      <w:r>
+        <w:t xml:space="preserve"> </w:t>
+      </w:r>
+      <w:r>
+        <w:t xml:space="preserve">prácticamente intacto (1,0055 a 1,0059).</w:t>
       </w:r>
     </w:p>
     <w:p>
@@ -12933,18 +12909,18 @@
               <w:rPr>
                 <w:b/>
               </w:rPr>
-              <w:t xml:space="preserve">5,48 %</w:t>
-            </w:r>
-          </w:p>
-        </w:tc>
-        <w:tc>
-          <w:p>
-            <w:pPr>
-              <w:pStyle w:val="Compact"/>
-              <w:jc w:val="left"/>
-            </w:pPr>
-            <w:r>
-              <w:t xml:space="preserve">5,80 %</w:t>
+              <w:t xml:space="preserve">5,52 %</w:t>
+            </w:r>
+          </w:p>
+        </w:tc>
+        <w:tc>
+          <w:p>
+            <w:pPr>
+              <w:pStyle w:val="Compact"/>
+              <w:jc w:val="left"/>
+            </w:pPr>
+            <w:r>
+              <w:t xml:space="preserve">5,79 %</w:t>
             </w:r>
           </w:p>
         </w:tc>
@@ -12993,18 +12969,18 @@
               <w:rPr>
                 <w:b/>
               </w:rPr>
-              <w:t xml:space="preserve">6,76 %</w:t>
-            </w:r>
-          </w:p>
-        </w:tc>
-        <w:tc>
-          <w:p>
-            <w:pPr>
-              <w:pStyle w:val="Compact"/>
-              <w:jc w:val="left"/>
-            </w:pPr>
-            <w:r>
-              <w:t xml:space="preserve">7,25 %</w:t>
+              <w:t xml:space="preserve">6,83 %</w:t>
+            </w:r>
+          </w:p>
+        </w:tc>
+        <w:tc>
+          <w:p>
+            <w:pPr>
+              <w:pStyle w:val="Compact"/>
+              <w:jc w:val="left"/>
+            </w:pPr>
+            <w:r>
+              <w:t xml:space="preserve">7,28 %</w:t>
             </w:r>
           </w:p>
         </w:tc>
@@ -13053,7 +13029,7 @@
               <w:rPr>
                 <w:b/>
               </w:rPr>
-              <w:t xml:space="preserve">8,03 %</w:t>
+              <w:t xml:space="preserve">8,14 %</w:t>
             </w:r>
           </w:p>
         </w:tc>
@@ -13113,18 +13089,18 @@
               <w:rPr>
                 <w:b/>
               </w:rPr>
-              <w:t xml:space="preserve">9,93 %</w:t>
-            </w:r>
-          </w:p>
-        </w:tc>
-        <w:tc>
-          <w:p>
-            <w:pPr>
-              <w:pStyle w:val="Compact"/>
-              <w:jc w:val="left"/>
-            </w:pPr>
-            <w:r>
-              <w:t xml:space="preserve">10,71 %</w:t>
+              <w:t xml:space="preserve">10,14 %</w:t>
+            </w:r>
+          </w:p>
+        </w:tc>
+        <w:tc>
+          <w:p>
+            <w:pPr>
+              <w:pStyle w:val="Compact"/>
+              <w:jc w:val="left"/>
+            </w:pPr>
+            <w:r>
+              <w:t xml:space="preserve">10,69 %</w:t>
             </w:r>
           </w:p>
         </w:tc>
@@ -13157,7 +13133,7 @@
         <w:pStyle w:val="BodyText"/>
       </w:pPr>
       <w:r>
-        <w:t xml:space="preserve">El ascendente gana en los cuatro niveles, por 0,3 a 0,5 puntos. La respuesta a Paul Rogers es que</w:t>
+        <w:t xml:space="preserve">El ascendente gana en los cuatro niveles, por 0,2 a 0,5 puntos. La respuesta a Paul Rogers es que</w:t>
       </w:r>
       <w:r>
         <w:t xml:space="preserve"> </w:t>
@@ -13193,7 +13169,7 @@
         <w:t xml:space="preserve"> </w:t>
       </w:r>
       <w:r>
-        <w:t xml:space="preserve">donde procede la ventaja. El error se compensa hacia arriba: baja del 9,9 % en departamento al</w:t>
+        <w:t xml:space="preserve">donde procede la ventaja. El error se compensa hacia arriba: baja del 10,1 % en departamento al</w:t>
       </w:r>
       <w:r>
         <w:t xml:space="preserve"> </w:t>
@@ -13211,7 +13187,7 @@
         <w:t xml:space="preserve"> </w:t>
       </w:r>
       <w:r>
-        <w:t xml:space="preserve">(el ascendente un 1,8 %), el sesgo tratado en §7.3.7.</w:t>
+        <w:t xml:space="preserve">(el ascendente un 1,8 %, Prophet un 1,3 %, la media móvil un 2,4 % y SARIMA un 3,8 %), el sesgo tratado en §7.3.7.</w:t>
       </w:r>
     </w:p>
     <w:p>
@@ -14386,13 +14362,13 @@
         <w:t xml:space="preserve"> </w:t>
       </w:r>
       <w:r>
-        <w:t xml:space="preserve">combina 400 días de historia, las variables de evento semanal y el grupo de</w:t>
-      </w:r>
-      <w:r>
-        <w:t xml:space="preserve"> </w:t>
-      </w:r>
-      <w:r>
-        <w:t xml:space="preserve">producto actual. En la última ventana de validación (28 de marzo a 24 de abril de 2016) obtiene un</w:t>
+        <w:t xml:space="preserve">combina 400 días de historia y las variables de evento semanal, sin el grupo de</w:t>
+      </w:r>
+      <w:r>
+        <w:t xml:space="preserve"> </w:t>
+      </w:r>
+      <w:r>
+        <w:t xml:space="preserve">producto. En la última ventana de validación (28 de marzo a 24 de abril de 2016) obtiene un</w:t>
       </w:r>
       <w:r>
         <w:t xml:space="preserve"> </w:t>
@@ -14407,10 +14383,13 @@
         <w:rPr>
           <w:b/>
         </w:rPr>
-        <w:t xml:space="preserve">0,9994</w:t>
-      </w:r>
-      <w:r>
-        <w:t xml:space="preserve">, el primero por debajo de 1, y un WAPE semanal del</w:t>
+        <w:t xml:space="preserve">1,0002</w:t>
+      </w:r>
+      <w:r>
+        <w:t xml:space="preserve"> </w:t>
+      </w:r>
+      <w:r>
+        <w:t xml:space="preserve">y un WAPE semanal del</w:t>
       </w:r>
       <w:r>
         <w:t xml:space="preserve"> </w:t>
@@ -14446,19 +14425,19 @@
         <w:t xml:space="preserve"> </w:t>
       </w:r>
       <w:r>
-        <w:t xml:space="preserve">de los días-producto, frente al 67,8 % de la</w:t>
-      </w:r>
-      <w:r>
-        <w:t xml:space="preserve"> </w:t>
-      </w:r>
-      <w:r>
-        <w:t xml:space="preserve">predicción media, y la media queda un 2,3 % por debajo de la demanda real. Es el modelo que genera</w:t>
-      </w:r>
-      <w:r>
-        <w:t xml:space="preserve"> </w:t>
-      </w:r>
-      <w:r>
-        <w:t xml:space="preserve">los ficheros de entrega (1.169.238 unidades de media y 2.647.580 de percentil 90 para el 25 de abril</w:t>
+        <w:t xml:space="preserve">de los días-producto, frente al 67,7 % de la</w:t>
+      </w:r>
+      <w:r>
+        <w:t xml:space="preserve"> </w:t>
+      </w:r>
+      <w:r>
+        <w:t xml:space="preserve">predicción media, y la media queda un 2,7 % por debajo de la demanda real. Es el modelo que genera</w:t>
+      </w:r>
+      <w:r>
+        <w:t xml:space="preserve"> </w:t>
+      </w:r>
+      <w:r>
+        <w:t xml:space="preserve">los ficheros de entrega (1.165.140 unidades de media y 2.640.527 de percentil 90 para el 25 de abril</w:t>
       </w:r>
       <w:r>
         <w:t xml:space="preserve"> </w:t>
@@ -14509,7 +14488,7 @@
         <w:t xml:space="preserve"> </w:t>
       </w:r>
       <w:r>
-        <w:t xml:space="preserve">Con 400 días de historia diciembre mejora un 5,7 %, pero sigue siendo el</w:t>
+        <w:t xml:space="preserve">Con 400 días de historia diciembre mejora un 5,3 %, pero sigue siendo el</w:t>
       </w:r>
       <w:r>
         <w:t xml:space="preserve"> </w:t>
@@ -15325,13 +15304,7 @@
         <w:t xml:space="preserve"> </w:t>
       </w:r>
       <w:r>
-        <w:t xml:space="preserve">estable— el nivel objetivo se toma del percentil de las ventas históricas en ventanas de nueve días, que en esas series es fiable.</w:t>
-      </w:r>
-      <w:r>
-        <w:t xml:space="preserve"/>
-      </w:r>
-      <w:r>
-        <w:t xml:space="preserve"> Para las de</w:t>
+        <w:t xml:space="preserve">estable— el nivel objetivo se toma del percentil de las ventas históricas en ventanas de nueve días, que en esas series es fiable. Para las de</w:t>
       </w:r>
       <w:r>
         <w:t xml:space="preserve"> </w:t>
@@ -24323,13 +24296,7 @@
         <w:t xml:space="preserve"> </w:t>
       </w:r>
       <w:r>
-        <w:t xml:space="preserve">codo y estables entre semillas (índice de Rand ajustado 0,98), con nombres que describen su comportamiento de compra:</w:t>
-      </w:r>
-      <w:r>
-        <w:t xml:space="preserve"/>
-      </w:r>
-      <w:r>
-        <w:t xml:space="preserve"> Alta rotación diaria, Pico de fin de semana, Rotación baja sin picos,</w:t>
+        <w:t xml:space="preserve">codo y estables entre semillas (índice de Rand ajustado 0,98), con nombres que describen su comportamiento de compra: Alta rotación diaria, Pico de fin de semana, Rotación baja sin picos,</w:t>
       </w:r>
       <w:r>
         <w:t xml:space="preserve"> </w:t>
@@ -24462,13 +24429,13 @@
         <w:t xml:space="preserve"> </w:t>
       </w:r>
       <w:r>
-        <w:t xml:space="preserve">El mejor resultado corresponde a LightGBM con objetivo Tweedie y</w:t>
-      </w:r>
-      <w:r>
-        <w:t xml:space="preserve"> </w:t>
-      </w:r>
-      <w:r>
-        <w:t xml:space="preserve">estrategia por bloques semanales, con un WRMSSE de 1,0407. El hallazgo metodológico es que</w:t>
+        <w:t xml:space="preserve">El modelo adoptado es LightGBM con objetivo Tweedie y</w:t>
+      </w:r>
+      <w:r>
+        <w:t xml:space="preserve"> </w:t>
+      </w:r>
+      <w:r>
+        <w:t xml:space="preserve">estrategia por bloques semanales, con un WRMSSE de 1,0422 (XGBoost queda un 0,7 % por delante, 1,0352). El hallazgo metodológico es que</w:t>
       </w:r>
       <w:r>
         <w:t xml:space="preserve"> </w:t>
@@ -24489,7 +24456,7 @@
         <w:rPr>
           <w:b/>
         </w:rPr>
-        <w:t xml:space="preserve">estrategia de horizonte pesó unas diez veces más que la elección de biblioteca</w:t>
+        <w:t xml:space="preserve">estrategia de horizonte pesó unas tres veces más que la elección de biblioteca</w:t>
       </w:r>
       <w:r>
         <w:t xml:space="preserve">: con la</w:t>
@@ -25289,7 +25256,7 @@
         <w:t xml:space="preserve"> </w:t>
       </w:r>
       <w:r>
-        <w:t xml:space="preserve">diciembre un 5,7 %, pero el pico del 31 de diciembre sigue infravalorado y la validación en</w:t>
+        <w:t xml:space="preserve">diciembre un 5,3 %, pero el pico del 31 de diciembre sigue infravalorado y la validación en</w:t>
       </w:r>
       <w:r>
         <w:t xml:space="preserve"> </w:t>
@@ -25831,7 +25798,7 @@
         <w:t xml:space="preserve">capacidad</w:t>
       </w:r>
       <w:r>
-        <w:t xml:space="preserve">, dado que la media móvil de 28 días concentra el 58,2% de la importancia y el techo</w:t>
+        <w:t xml:space="preserve">, dado que la media móvil de 28 días concentra el 54,1% de la importancia y el techo</w:t>
       </w:r>
       <w:r>
         <w:t xml:space="preserve"> </w:t>

</xml_diff>

<commit_message>
Revision del notebook 04: cifras coherentes en memoria y documentacion
</commit_message>
<xml_diff>
--- a/memoria/Memoria_DSMarket.docx
+++ b/memoria/Memoria_DSMarket.docx
@@ -518,7 +518,7 @@
         <w:pStyle w:val="BodyText"/>
       </w:pPr>
       <w:r>
-        <w:t xml:space="preserve">Demand is not homogeneous: only five of the fifteen best-selling products are common to the three cities, and the similarity between stores does not follow geographic boundaries. The best forecasting model reaches a WRMSSE of 1.0407 (0.9994 in the last window with the final model, trained on 400 days of history); the horizon strategy proves roughly ten times more influential than the choice of library, and reformulating the target as the total of the replenishment cycle reduces the error by a further 15.7% and removes a bias of −7.4%. Summing individual predictions outperforms modelling each aggregate separately (Prophet, SARIMA) at the four levels evaluated. The proposed replenishment policy raises the service level from 86.6% to 96.2% while reducing total cost by 62.5%, and the cost-based comparison shows that a uniform 90% service level was 2.45 times more expensive than the optimum. Price elasticity, by contrast, is not identifiable with these data: a temporal falsification test refutes the estimate obtained.</w:t>
+        <w:t xml:space="preserve">Demand is not homogeneous: only five of the fifteen best-selling products are common to the three cities, and the similarity between stores does not follow geographic boundaries. The adopted forecasting model reaches a WRMSSE of 1.0422 (1.0002 in the last window with the final model, trained on 400 days of history); the horizon strategy proves roughly three times more influential than the choice of library, and reformulating the target as the total of the replenishment cycle reduces the error by a further 15.7% and removes a bias of −7.4%. Summing individual predictions outperforms modelling each aggregate separately (Prophet, SARIMA) at the four levels evaluated. The proposed replenishment policy raises the service level from 86.6% to 96.2% while reducing total cost by 62.5%, and the cost-based comparison shows that a uniform 90% service level was 2.45 times more expensive than the optimum. Price elasticity, by contrast, is not identifiable with these data: a temporal falsification test refutes the estimate obtained.</w:t>
       </w:r>
     </w:p>
     <w:p>
@@ -17404,7 +17404,7 @@
         <w:rPr>
           <w:b/>
         </w:rPr>
-        <w:t xml:space="preserve">127% más de stock</w:t>
+        <w:t xml:space="preserve">128% más de stock</w:t>
       </w:r>
       <w:r>
         <w:t xml:space="preserve">. La curva es</w:t>

</xml_diff>

<commit_message>
03, 04 y memoria: celda suelta, MinT, nota del 7.4 y plan de fases
</commit_message>
<xml_diff>
--- a/memoria/Memoria_DSMarket.docx
+++ b/memoria/Memoria_DSMarket.docx
@@ -1707,25 +1707,7 @@
         <w:t xml:space="preserve"> </w:t>
       </w:r>
       <w:r>
-        <w:t xml:space="preserve">minimizando la traza de la matriz de covarianzas del error de reconciliación. Este último es el</w:t>
-      </w:r>
-      <w:r>
-        <w:t xml:space="preserve"> </w:t>
-      </w:r>
-      <w:r>
-        <w:t xml:space="preserve">método con el que se contrastó la reconciliación en §7.3.8 como ejercicio complementario al</w:t>
-      </w:r>
-      <w:r>
-        <w:t xml:space="preserve"> </w:t>
-      </w:r>
-      <w:r>
-        <w:t xml:space="preserve">enfoque ascendente, y su propiedad más valiosa para la organización no es la mejora del error</w:t>
-      </w:r>
-      <w:r>
-        <w:t xml:space="preserve"> </w:t>
-      </w:r>
-      <w:r>
-        <w:t xml:space="preserve">sino la garantía de coherencia entre niveles.</w:t>
+        <w:t xml:space="preserve">minimizando la traza de la matriz de covarianzas del error de reconciliación. Este trabajo emplea el enfoque ascendente, que es coherente por construcción, y lo contrasta en §7.3.8 con el modelado directo de cada nivel; la reconciliación óptima queda como mejora posible.</w:t>
       </w:r>
     </w:p>
     <w:bookmarkEnd w:id="32"/>
@@ -13517,25 +13499,7 @@
         <w:pStyle w:val="BodyText"/>
       </w:pPr>
       <w:r>
-        <w:t xml:space="preserve">Un ejercicio complementario de reconciliación óptima (MinT) sobre los seis niveles de la jerarquía,</w:t>
-      </w:r>
-      <w:r>
-        <w:t xml:space="preserve"> </w:t>
-      </w:r>
-      <w:r>
-        <w:t xml:space="preserve">con una medida de error distinta, mejoró al enfoque ascendente del 15,12 % al 13,71 % y añade la</w:t>
-      </w:r>
-      <w:r>
-        <w:t xml:space="preserve"> </w:t>
-      </w:r>
-      <w:r>
-        <w:t xml:space="preserve">propiedad de coherencia garantizada entre niveles. No cambia la respuesta: sumar es válido, y</w:t>
-      </w:r>
-      <w:r>
-        <w:t xml:space="preserve"> </w:t>
-      </w:r>
-      <w:r>
-        <w:t xml:space="preserve">reconciliar es una mejora opcional.</w:t>
+        <w:t xml:space="preserve">El enfoque ascendente tiene además la ventaja de ser coherente por construcción: la suma de las tiendas coincide siempre con el total de la ciudad. Los métodos de reconciliación óptima (§4.4.3) quedan como mejora posible, pero no cambian la respuesta: sumar es válido.</w:t>
       </w:r>
     </w:p>
     <w:p>
@@ -16865,13 +16829,7 @@
         </m:r>
       </m:oMath>
       <w:r>
-        <w:t xml:space="preserve">. La distancia respecto del 0,90 uniforme es considerable, y la</w:t>
-      </w:r>
-      <w:r>
-        <w:t xml:space="preserve"> </w:t>
-      </w:r>
-      <w:r>
-        <w:t xml:space="preserve">consecuencia es que hoy el sistema pide de más en unos productos y de menos en otros.</w:t>
+        <w:t xml:space="preserve">. La distancia respecto del 0,90 uniforme es considerable, y la consecuencia es que hoy el sistema pide de más en unos productos y de menos en otros. Este ratio no contradice el óptimo del 99 % de §7.4.6, que procede de supuestos distintos: aquel cálculo, como el cuaderno 04, valora el coste de mantener una unidad con un 25 % anual sobre su coste, unos dos céntimos en nueve días, mientras que este experimento lo cobra como un 5 % del precio en cada ciclo. Con un coste de mantenimiento tan bajo, el ratio crítico sube al 98 % y el óptimo de la curva, al 99 %.</w:t>
       </w:r>
     </w:p>
     <w:p>

</xml_diff>

<commit_message>
Notebooks 03 y 04 sin faltante; memoria: articulos en las referencias
</commit_message>
<xml_diff>
--- a/memoria/Memoria_DSMarket.docx
+++ b/memoria/Memoria_DSMarket.docx
@@ -10415,13 +10415,13 @@
         <w:t>-</w:t>
       </w:r>
       <w:r>
-        <w:t xml:space="preserve"> es el fundamento de la política desarrollada en </w:t>
-      </w:r>
-      <w:r>
-        <w:t xml:space="preserve">Punto </w:t>
-      </w:r>
-      <w:r>
-        <w:t>7.4. Los tratados de Silver, Pyke y Thomas (2016) y Zipkin (2000) proporcionan las políticas de revisión periódica, el dimensionamiento del stock de seguridad y la clasificación ABC/XYZ empleadas en este trabajo.</w:t>
+        <w:t xml:space="preserve"> es el fundamento de la política desarrollada en el Punto 7.4</w:t>
+      </w:r>
+      <w:r>
+        <w:t xml:space="preserve"/>
+      </w:r>
+      <w:r>
+        <w:t xml:space="preserve">. Los tratados de Silver, Pyke y Thomas (2016) y Zipkin (2000) proporcionan las políticas de revisión periódica, el dimensionamiento del stock de seguridad y la clasificación ABC/XYZ empleadas en este trabajo.</w:t>
       </w:r>
     </w:p>
     <w:p>
@@ -15525,13 +15525,13 @@
         <w:jc w:val="both"/>
       </w:pPr>
       <w:r>
-        <w:t xml:space="preserve">Los días de cierre de establecimiento aparecen con claridad como ceros exactos en la venta agregada de una tienda. Se identificaron y se marcaron, y su tratamiento tiene consecuencias que se cuantifican en </w:t>
-      </w:r>
-      <w:r>
-        <w:t xml:space="preserve">Apartado </w:t>
-      </w:r>
-      <w:r>
-        <w:t>7.3.</w:t>
+        <w:t xml:space="preserve">Los días de cierre de establecimiento aparecen con claridad como ceros exactos en la venta agregada de una tienda. Se identificaron y se marcaron, y su tratamiento tiene consecuencias que se cuantifican en el Apartado 7.3</w:t>
+      </w:r>
+      <w:r>
+        <w:t xml:space="preserve"/>
+      </w:r>
+      <w:r>
+        <w:t xml:space="preserve">.</w:t>
       </w:r>
     </w:p>
     <w:p>
@@ -17389,13 +17389,13 @@
         <w:t>7,66</w:t>
       </w:r>
       <w:r>
-        <w:t xml:space="preserve">, la mayor del catálogo. Sus cuatro mejores días en cinco años son cuatro 31 de diciembre consecutivos: se trata, con toda probabilidad, de un artículo de Nochevieja. El caso ilustra un límite del enfoque predictivo que se desarrolla en </w:t>
-      </w:r>
-      <w:r>
-        <w:t xml:space="preserve">Punto </w:t>
-      </w:r>
-      <w:r>
-        <w:t>7.3: un modelo entrenado sobre una ventana de 180 días nunca ve un 31 de diciembre cuando predice diciembre. Por eso el modelo final se entrena con 400 días de historia, de forma que vea al menos un ejemplo de cada fecha señalada.</w:t>
+        <w:t xml:space="preserve">, la mayor del catálogo. Sus cuatro mejores días en cinco años son cuatro 31 de diciembre consecutivos: se trata, con toda probabilidad, de un artículo de Nochevieja. El caso ilustra un límite del enfoque predictivo que se desarrolla en el Punto 7.3</w:t>
+      </w:r>
+      <w:r>
+        <w:t xml:space="preserve"/>
+      </w:r>
+      <w:r>
+        <w:t xml:space="preserve">: un modelo entrenado sobre una ventana de 180 días nunca ve un 31 de diciembre cuando predice diciembre. Por eso el modelo final se entrena con 400 días de historia, de forma que vea al menos un ejemplo de cada fecha señalada.</w:t>
       </w:r>
     </w:p>
     <w:p>
@@ -20661,13 +20661,13 @@
       </w:r>
       <w:r>
         <w:lastRenderedPageBreak/>
-        <w:t xml:space="preserve">para las mismas cuatro semanas). La decisión de dónde situarse en esa curva no es estadística sino económica, y se resuelve en </w:t>
-      </w:r>
-      <w:r>
-        <w:t xml:space="preserve">Punto </w:t>
-      </w:r>
-      <w:r>
-        <w:t>7.4.</w:t>
+        <w:t xml:space="preserve">para las mismas cuatro semanas). La decisión de dónde situarse en esa curva no es estadística sino económica, y se resuelve en el Punto 7.4</w:t>
+      </w:r>
+      <w:r>
+        <w:t xml:space="preserve"/>
+      </w:r>
+      <w:r>
+        <w:t xml:space="preserve">.</w:t>
       </w:r>
     </w:p>
     <w:p>
@@ -21370,13 +21370,13 @@
         <w:t>sumar las previsiones individuales es válido y mejora a modelar cada agregado por separado</w:t>
       </w:r>
       <w:r>
-        <w:t xml:space="preserve">: basta un único modelo a nivel tienda-producto y todos los informes se obtienen sumando, sin resolver inconsistencias entre totales. Prophet y SARIMA capturan bien la estacionalidad del agregado, pero no pueden aprovechar la información de las 30.490 series individuales, que es de donde procede la ventaja. El error se compensa hacia arriba: baja del 10,1 % en departamento al 5,5 % en compañía, de modo que la precisión del número que ve el comité de dirección no informa sobre la que necesita quien repone un producto en una tienda. Todos los enfoques subestiman (el ascendente un 1,8 %, Prophet un 1,3 %, la media móvil un 2,4 % y SARIMA un 3,8 %), el sesgo tratado en </w:t>
-      </w:r>
-      <w:r>
-        <w:t xml:space="preserve">Apartado </w:t>
-      </w:r>
-      <w:r>
-        <w:t>7.3.7.</w:t>
+        <w:t xml:space="preserve">: basta un único modelo a nivel tienda-producto y todos los informes se obtienen sumando, sin resolver inconsistencias entre totales. Prophet y SARIMA capturan bien la estacionalidad del agregado, pero no pueden aprovechar la información de las 30.490 series individuales, que es de donde procede la ventaja. El error se compensa hacia arriba: baja del 10,1 % en departamento al 5,5 % en compañía, de modo que la precisión del número que ve el comité de dirección no informa sobre la que necesita quien repone un producto en una tienda. Todos los enfoques subestiman (el ascendente un 1,8 %, Prophet un 1,3 %, la media móvil un 2,4 % y SARIMA un 3,8 %), el sesgo tratado en el Apartado 7.3.7</w:t>
+      </w:r>
+      <w:r>
+        <w:t xml:space="preserve"/>
+      </w:r>
+      <w:r>
+        <w:t xml:space="preserve">.</w:t>
       </w:r>
     </w:p>
     <w:p>
@@ -30164,13 +30164,13 @@
         <w:t>Cordura absoluta.</w:t>
       </w:r>
       <w:r>
-        <w:t xml:space="preserve"> La cobertura empírica del percentil 90 debe caer entre el 85% y el 95%. La banda tiene dos lados a propósito. Un intervalo que cubre el 99% no es prudente: es stock de seguridad inflado en todo el surtido, y </w:t>
-      </w:r>
-      <w:r>
-        <w:t xml:space="preserve">Apartado </w:t>
-      </w:r>
-      <w:r>
-        <w:t>7.4 cuantifica lo que cuesta esa clase de prudencia.</w:t>
+        <w:t xml:space="preserve"> La cobertura empírica del percentil 90 debe caer entre el 85% y el 95%. La banda tiene dos lados a propósito. Un intervalo que cubre el 99% no es prudente: es stock de seguridad inflado en todo el surtido, y el Apartado 7.4 cuantifica</w:t>
+      </w:r>
+      <w:r>
+        <w:t xml:space="preserve"/>
+      </w:r>
+      <w:r>
+        <w:t xml:space="preserve"> lo que cuesta esa clase de prudencia.</w:t>
       </w:r>
     </w:p>
     <w:p>
@@ -32804,13 +32804,13 @@
         <w:t>Recalibrar el nivel de servicio por segmento con el ratio crítico.</w:t>
       </w:r>
       <w:r>
-        <w:t xml:space="preserve"> Es la consecuencia inmediata de </w:t>
-      </w:r>
-      <w:r>
-        <w:t xml:space="preserve">Apartado </w:t>
-      </w:r>
-      <w:r>
-        <w:t xml:space="preserve">7.4.5 y la de mayor efecto económico medido: sustituir el 0,90 uniforme por el </w:t>
+        <w:t xml:space="preserve"> Es la consecuencia inmediata del Apartado 7.4.5</w:t>
+      </w:r>
+      <w:r>
+        <w:t xml:space="preserve"/>
+      </w:r>
+      <w:r>
+        <w:t xml:space="preserve"> y la de mayor efecto económico medido: sustituir el 0,90 uniforme por el </w:t>
       </w:r>
       <m:oMath>
         <m:sSup>
@@ -32881,13 +32881,13 @@
         <w:t>Métodos específicos para demanda intermitente.</w:t>
       </w:r>
       <w:r>
-        <w:t xml:space="preserve"> La venta esporádica y las series de clase Z siguen siendo donde el error de predicción es mayor, y la comparación de </w:t>
-      </w:r>
-      <w:r>
-        <w:t xml:space="preserve">Apartado </w:t>
-      </w:r>
-      <w:r>
-        <w:t>7.4.5 lo confirma por otra vía: en el segmento CZ la media móvil simple supera al modelo.</w:t>
+        <w:t xml:space="preserve"> La venta esporádica y las series de clase Z siguen siendo donde el error de predicción es mayor, y la comparación del Apartado 7.4.5</w:t>
+      </w:r>
+      <w:r>
+        <w:t xml:space="preserve"/>
+      </w:r>
+      <w:r>
+        <w:t xml:space="preserve"> lo confirma por otra vía: en el segmento CZ la media móvil simple supera al modelo.</w:t>
       </w:r>
     </w:p>
     <w:p>
@@ -32903,13 +32903,13 @@
         <w:t>Predicción de productos sin histórico.</w:t>
       </w:r>
       <w:r>
-        <w:t xml:space="preserve"> Una referencia nueva llega al lineal sin retardos ni medias móviles, es decir sin el 88% de la información que usa el modelo, y es justo el momento en que un error de dimensionamiento resulta más caro. La vía natural es predecir su nivel de demanda a partir de sus atributos y del comportamiento de la misma referencia en la tienda más parecida, lo que da un uso operativo a la comparación de tiendas de </w:t>
-      </w:r>
-      <w:r>
-        <w:t xml:space="preserve">Apartado </w:t>
-      </w:r>
-      <w:r>
-        <w:t>7.2.</w:t>
+        <w:t xml:space="preserve"> Una referencia nueva llega al lineal sin retardos ni medias móviles, es decir sin el 88% de la información que usa el modelo, y es justo el momento en que un error de dimensionamiento resulta más caro. La vía natural es predecir su nivel de demanda a partir de sus atributos y del comportamiento de la misma referencia en la tienda más parecida, lo que da un uso operativo a la comparación de tiendas del Apartado 7.2.</w:t>
+      </w:r>
+      <w:r>
+        <w:t xml:space="preserve"/>
+      </w:r>
+      <w:r>
+        <w:t xml:space="preserve"/>
       </w:r>
     </w:p>
     <w:p>
@@ -32955,13 +32955,13 @@
         <w:t>El experimento de precios.</w:t>
       </w:r>
       <w:r>
-        <w:t xml:space="preserve"> Es la única vía para responder la pregunta del capítulo </w:t>
-      </w:r>
-      <w:r>
-        <w:t xml:space="preserve">Apartado </w:t>
-      </w:r>
-      <w:r>
-        <w:t>7.5, y su diseño y dimensionamiento ya están calculados.</w:t>
+        <w:t xml:space="preserve"> Es la única vía para responder la pregunta del Apartado 7.5</w:t>
+      </w:r>
+      <w:r>
+        <w:t xml:space="preserve"/>
+      </w:r>
+      <w:r>
+        <w:t xml:space="preserve">, y su diseño y dimensionamiento ya están calculados.</w:t>
       </w:r>
     </w:p>
     <w:p>
@@ -32993,13 +32993,13 @@
         <w:t>Incorporar el inventario diario al registro.</w:t>
       </w:r>
       <w:r>
-        <w:t xml:space="preserve"> Es el dato que convertiría las cotas de </w:t>
-      </w:r>
-      <w:r>
-        <w:t xml:space="preserve">Apartado </w:t>
-      </w:r>
-      <w:r>
-        <w:t>7.4.7 en una medición, permitiría entrenar los modelos sobre demanda no censurada y cerraría la limitación principal del trabajo. Después de medir la merma, es la recomendación de mayor valor para la compañía.</w:t>
+        <w:t xml:space="preserve"> Es el dato que convertiría las cotas del Apartado 7.4.7</w:t>
+      </w:r>
+      <w:r>
+        <w:t xml:space="preserve"/>
+      </w:r>
+      <w:r>
+        <w:t xml:space="preserve"> en una medición, permitiría entrenar los modelos sobre demanda no censurada y cerraría la limitación principal del trabajo. Después de medir la merma, es la recomendación de mayor valor para la compañía.</w:t>
       </w:r>
     </w:p>
     <w:p>

</xml_diff>